<commit_message>
refactor to use signal
</commit_message>
<xml_diff>
--- a/public/assets/download/Peter_Nguyen_Resume.docx
+++ b/public/assets/download/Peter_Nguyen_Resume.docx
@@ -259,19 +259,44 @@
         <w:ind w:left="73" w:right="0" w:firstLine="0"/>
         <w:jc w:val="left"/>
         <w:rPr>
-          <w:sz w:val="33"/>
-          <w:szCs w:val="33"/>
-        </w:rPr>
-      </w:pPr>
-      <w:r>
-        <w:rPr>
           <w:color w:val="ffffff"/>
           <w:sz w:val="33"/>
           <w:szCs w:val="33"/>
+        </w:rPr>
+      </w:pPr>
+      <w:r>
+        <w:rPr>
+          <w:color w:val="ffffff"/>
+          <w:sz w:val="33"/>
+          <w:szCs w:val="33"/>
           <w:rtl w:val="0"/>
         </w:rPr>
         <w:t xml:space="preserve">Front End Senior/Lead</w:t>
       </w:r>
+    </w:p>
+    <w:p>
+      <w:pPr>
+        <w:spacing w:before="103" w:lineRule="auto"/>
+        <w:ind w:left="73" w:right="0" w:firstLine="0"/>
+        <w:jc w:val="left"/>
+        <w:rPr>
+          <w:color w:val="999999"/>
+          <w:sz w:val="33"/>
+          <w:szCs w:val="33"/>
+        </w:rPr>
+      </w:pPr>
+      <w:hyperlink r:id="rId7">
+        <w:r>
+          <w:rPr>
+            <w:color w:val="999999"/>
+            <w:sz w:val="33"/>
+            <w:szCs w:val="33"/>
+            <w:u w:val="single"/>
+            <w:rtl w:val="0"/>
+          </w:rPr>
+          <w:t xml:space="preserve">www.peternguyencs.com</w:t>
+        </w:r>
+      </w:hyperlink>
       <w:r>
         <w:rPr>
           <w:rtl w:val="0"/>
@@ -338,7 +363,7 @@
                     <pic:cNvPicPr preferRelativeResize="0"/>
                   </pic:nvPicPr>
                   <pic:blipFill>
-                    <a:blip r:embed="rId7"/>
+                    <a:blip r:embed="rId8"/>
                     <a:srcRect b="0" l="0" r="0" t="0"/>
                     <a:stretch>
                       <a:fillRect/>
@@ -402,16 +427,16 @@
           <wp:inline distB="0" distT="0" distL="0" distR="0">
             <wp:extent cx="108331" cy="84633"/>
             <wp:effectExtent b="0" l="0" r="0" t="0"/>
-            <wp:docPr id="41" name="image7.png"/>
+            <wp:docPr id="41" name="image8.png"/>
             <a:graphic>
               <a:graphicData uri="http://schemas.openxmlformats.org/drawingml/2006/picture">
                 <pic:pic>
                   <pic:nvPicPr>
-                    <pic:cNvPr id="0" name="image7.png"/>
+                    <pic:cNvPr id="0" name="image8.png"/>
                     <pic:cNvPicPr preferRelativeResize="0"/>
                   </pic:nvPicPr>
                   <pic:blipFill>
-                    <a:blip r:embed="rId8"/>
+                    <a:blip r:embed="rId9"/>
                     <a:srcRect b="0" l="0" r="0" t="0"/>
                     <a:stretch>
                       <a:fillRect/>
@@ -440,7 +465,7 @@
         </w:rPr>
         <w:t xml:space="preserve"> </w:t>
       </w:r>
-      <w:hyperlink r:id="rId9">
+      <w:hyperlink r:id="rId10">
         <w:r>
           <w:rPr>
             <w:color w:val="ffffff"/>
@@ -510,16 +535,16 @@
           <wp:inline distB="0" distT="0" distL="0" distR="0">
             <wp:extent cx="116926" cy="116577"/>
             <wp:effectExtent b="0" l="0" r="0" t="0"/>
-            <wp:docPr id="40" name="image5.png"/>
+            <wp:docPr id="40" name="image6.png"/>
             <a:graphic>
               <a:graphicData uri="http://schemas.openxmlformats.org/drawingml/2006/picture">
                 <pic:pic>
                   <pic:nvPicPr>
-                    <pic:cNvPr id="0" name="image5.png"/>
+                    <pic:cNvPr id="0" name="image6.png"/>
                     <pic:cNvPicPr preferRelativeResize="0"/>
                   </pic:nvPicPr>
                   <pic:blipFill>
-                    <a:blip r:embed="rId10"/>
+                    <a:blip r:embed="rId11"/>
                     <a:srcRect b="0" l="0" r="0" t="0"/>
                     <a:stretch>
                       <a:fillRect/>
@@ -636,16 +661,16 @@
           <wp:inline distB="0" distT="0" distL="0" distR="0">
             <wp:extent cx="95212" cy="126727"/>
             <wp:effectExtent b="0" l="0" r="0" t="0"/>
-            <wp:docPr id="43" name="image8.png"/>
+            <wp:docPr id="43" name="image5.png"/>
             <a:graphic>
               <a:graphicData uri="http://schemas.openxmlformats.org/drawingml/2006/picture">
                 <pic:pic>
                   <pic:nvPicPr>
-                    <pic:cNvPr id="0" name="image8.png"/>
+                    <pic:cNvPr id="0" name="image5.png"/>
                     <pic:cNvPicPr preferRelativeResize="0"/>
                   </pic:nvPicPr>
                   <pic:blipFill>
-                    <a:blip r:embed="rId11"/>
+                    <a:blip r:embed="rId12"/>
                     <a:srcRect b="0" l="0" r="0" t="0"/>
                     <a:stretch>
                       <a:fillRect/>
@@ -751,7 +776,7 @@
           <w:vertAlign w:val="baseline"/>
         </w:rPr>
       </w:pPr>
-      <w:hyperlink r:id="rId12">
+      <w:hyperlink r:id="rId13">
         <w:r>
           <w:rPr>
             <w:rFonts w:ascii="Cambria" w:cs="Cambria" w:eastAsia="Cambria" w:hAnsi="Cambria"/>
@@ -790,16 +815,16 @@
             <wp:extent cx="113890" cy="113207"/>
             <wp:effectExtent b="0" l="0" r="0" t="0"/>
             <wp:wrapNone/>
-            <wp:docPr id="42" name="image6.png"/>
+            <wp:docPr id="42" name="image4.png"/>
             <a:graphic>
               <a:graphicData uri="http://schemas.openxmlformats.org/drawingml/2006/picture">
                 <pic:pic>
                   <pic:nvPicPr>
-                    <pic:cNvPr id="0" name="image6.png"/>
+                    <pic:cNvPr id="0" name="image4.png"/>
                     <pic:cNvPicPr preferRelativeResize="0"/>
                   </pic:nvPicPr>
                   <pic:blipFill>
-                    <a:blip r:embed="rId13"/>
+                    <a:blip r:embed="rId14"/>
                     <a:srcRect b="0" l="0" r="0" t="0"/>
                     <a:stretch>
                       <a:fillRect/>
@@ -1044,7 +1069,7 @@
                             <pic:cNvPicPr preferRelativeResize="0"/>
                           </pic:nvPicPr>
                           <pic:blipFill rotWithShape="1">
-                            <a:blip r:embed="rId14">
+                            <a:blip r:embed="rId15">
                               <a:alphaModFix/>
                             </a:blip>
                             <a:srcRect b="0" l="0" r="0" t="0"/>
@@ -1556,7 +1581,7 @@
                             <pic:cNvPicPr preferRelativeResize="0"/>
                           </pic:nvPicPr>
                           <pic:blipFill rotWithShape="1">
-                            <a:blip r:embed="rId15">
+                            <a:blip r:embed="rId16">
                               <a:alphaModFix/>
                             </a:blip>
                             <a:srcRect b="0" l="0" r="0" t="0"/>
@@ -2111,7 +2136,7 @@
                             <pic:cNvPicPr preferRelativeResize="0"/>
                           </pic:nvPicPr>
                           <pic:blipFill rotWithShape="1">
-                            <a:blip r:embed="rId16">
+                            <a:blip r:embed="rId17">
                               <a:alphaModFix/>
                             </a:blip>
                             <a:srcRect b="0" l="0" r="0" t="0"/>
@@ -4769,7 +4794,7 @@
                             <pic:cNvPicPr preferRelativeResize="0"/>
                           </pic:nvPicPr>
                           <pic:blipFill rotWithShape="1">
-                            <a:blip r:embed="rId17">
+                            <a:blip r:embed="rId18">
                               <a:alphaModFix/>
                             </a:blip>
                             <a:srcRect b="0" l="0" r="0" t="0"/>
@@ -4972,7 +4997,35 @@
           <w:vertAlign w:val="baseline"/>
           <w:rtl w:val="0"/>
         </w:rPr>
-        <w:t xml:space="preserve">Angular (v12–17), AngularJS (old)</w:t>
+        <w:t xml:space="preserve">Angular (v12–</w:t>
+      </w:r>
+      <w:r>
+        <w:rPr>
+          <w:color w:val="ffffff"/>
+          <w:sz w:val="20"/>
+          <w:szCs w:val="20"/>
+          <w:rtl w:val="0"/>
+        </w:rPr>
+        <w:t xml:space="preserve">21</w:t>
+      </w:r>
+      <w:r>
+        <w:rPr>
+          <w:rFonts w:ascii="Cambria" w:cs="Cambria" w:eastAsia="Cambria" w:hAnsi="Cambria"/>
+          <w:b w:val="0"/>
+          <w:bCs w:val="0"/>
+          <w:i w:val="0"/>
+          <w:iCs w:val="0"/>
+          <w:smallCaps w:val="0"/>
+          <w:strike w:val="0"/>
+          <w:color w:val="ffffff"/>
+          <w:sz w:val="20"/>
+          <w:szCs w:val="20"/>
+          <w:u w:val="none"/>
+          <w:shd w:fill="auto" w:val="clear"/>
+          <w:vertAlign w:val="baseline"/>
+          <w:rtl w:val="0"/>
+        </w:rPr>
+        <w:t xml:space="preserve">), AngularJS (old)</w:t>
       </w:r>
       <w:r>
         <w:rPr>
@@ -5675,12 +5728,12 @@
                 <wp:extent cx="47625" cy="47625"/>
                 <wp:effectExtent b="0" l="0" r="0" t="0"/>
                 <wp:wrapNone/>
-                <wp:docPr id="29" name="image34.png"/>
+                <wp:docPr id="29" name="image37.png"/>
                 <a:graphic>
                   <a:graphicData uri="http://schemas.openxmlformats.org/drawingml/2006/picture">
                     <pic:pic>
                       <pic:nvPicPr>
-                        <pic:cNvPr id="0" name="image34.png"/>
+                        <pic:cNvPr id="0" name="image37.png"/>
                         <pic:cNvPicPr preferRelativeResize="0"/>
                       </pic:nvPicPr>
                       <pic:blipFill>
@@ -6451,12 +6504,12 @@
                 <wp:extent cx="47625" cy="47625"/>
                 <wp:effectExtent b="0" l="0" r="0" t="0"/>
                 <wp:wrapNone/>
-                <wp:docPr id="3" name="image4.png"/>
+                <wp:docPr id="3" name="image7.png"/>
                 <a:graphic>
                   <a:graphicData uri="http://schemas.openxmlformats.org/drawingml/2006/picture">
                     <pic:pic>
                       <pic:nvPicPr>
-                        <pic:cNvPr id="0" name="image4.png"/>
+                        <pic:cNvPr id="0" name="image7.png"/>
                         <pic:cNvPicPr preferRelativeResize="0"/>
                       </pic:nvPicPr>
                       <pic:blipFill>
@@ -7112,12 +7165,12 @@
                 <wp:extent cx="47625" cy="47625"/>
                 <wp:effectExtent b="0" l="0" r="0" t="0"/>
                 <wp:wrapNone/>
-                <wp:docPr id="36" name="image41.png"/>
+                <wp:docPr id="36" name="image44.png"/>
                 <a:graphic>
                   <a:graphicData uri="http://schemas.openxmlformats.org/drawingml/2006/picture">
                     <pic:pic>
                       <pic:nvPicPr>
-                        <pic:cNvPr id="0" name="image41.png"/>
+                        <pic:cNvPr id="0" name="image44.png"/>
                         <pic:cNvPicPr preferRelativeResize="0"/>
                       </pic:nvPicPr>
                       <pic:blipFill>
@@ -7514,12 +7567,12 @@
                 <wp:extent cx="47625" cy="47625"/>
                 <wp:effectExtent b="0" l="0" r="0" t="0"/>
                 <wp:wrapNone/>
-                <wp:docPr id="34" name="image39.png"/>
+                <wp:docPr id="34" name="image42.png"/>
                 <a:graphic>
                   <a:graphicData uri="http://schemas.openxmlformats.org/drawingml/2006/picture">
                     <pic:pic>
                       <pic:nvPicPr>
-                        <pic:cNvPr id="0" name="image39.png"/>
+                        <pic:cNvPr id="0" name="image42.png"/>
                         <pic:cNvPicPr preferRelativeResize="0"/>
                       </pic:nvPicPr>
                       <pic:blipFill>
@@ -7916,12 +7969,12 @@
                 <wp:extent cx="47625" cy="47625"/>
                 <wp:effectExtent b="0" l="0" r="0" t="0"/>
                 <wp:wrapNone/>
-                <wp:docPr id="31" name="image36.png"/>
+                <wp:docPr id="31" name="image39.png"/>
                 <a:graphic>
                   <a:graphicData uri="http://schemas.openxmlformats.org/drawingml/2006/picture">
                     <pic:pic>
                       <pic:nvPicPr>
-                        <pic:cNvPr id="0" name="image36.png"/>
+                        <pic:cNvPr id="0" name="image39.png"/>
                         <pic:cNvPicPr preferRelativeResize="0"/>
                       </pic:nvPicPr>
                       <pic:blipFill>
@@ -8117,12 +8170,12 @@
                 <wp:extent cx="47625" cy="47625"/>
                 <wp:effectExtent b="0" l="0" r="0" t="0"/>
                 <wp:wrapNone/>
-                <wp:docPr id="38" name="image43.png"/>
+                <wp:docPr id="38" name="image46.png"/>
                 <a:graphic>
                   <a:graphicData uri="http://schemas.openxmlformats.org/drawingml/2006/picture">
                     <pic:pic>
                       <pic:nvPicPr>
-                        <pic:cNvPr id="0" name="image43.png"/>
+                        <pic:cNvPr id="0" name="image46.png"/>
                         <pic:cNvPicPr preferRelativeResize="0"/>
                       </pic:nvPicPr>
                       <pic:blipFill>
@@ -8519,12 +8572,12 @@
                 <wp:extent cx="47625" cy="47625"/>
                 <wp:effectExtent b="0" l="0" r="0" t="0"/>
                 <wp:wrapNone/>
-                <wp:docPr id="32" name="image37.png"/>
+                <wp:docPr id="32" name="image40.png"/>
                 <a:graphic>
                   <a:graphicData uri="http://schemas.openxmlformats.org/drawingml/2006/picture">
                     <pic:pic>
                       <pic:nvPicPr>
-                        <pic:cNvPr id="0" name="image37.png"/>
+                        <pic:cNvPr id="0" name="image40.png"/>
                         <pic:cNvPicPr preferRelativeResize="0"/>
                       </pic:nvPicPr>
                       <pic:blipFill>
@@ -9137,12 +9190,12 @@
                 <wp:extent cx="47625" cy="47625"/>
                 <wp:effectExtent b="0" l="0" r="0" t="0"/>
                 <wp:wrapNone/>
-                <wp:docPr id="35" name="image40.png"/>
+                <wp:docPr id="35" name="image43.png"/>
                 <a:graphic>
                   <a:graphicData uri="http://schemas.openxmlformats.org/drawingml/2006/picture">
                     <pic:pic>
                       <pic:nvPicPr>
-                        <pic:cNvPr id="0" name="image40.png"/>
+                        <pic:cNvPr id="0" name="image43.png"/>
                         <pic:cNvPicPr preferRelativeResize="0"/>
                       </pic:nvPicPr>
                       <pic:blipFill>
@@ -9338,12 +9391,12 @@
                 <wp:extent cx="47625" cy="47625"/>
                 <wp:effectExtent b="0" l="0" r="0" t="0"/>
                 <wp:wrapNone/>
-                <wp:docPr id="28" name="image33.png"/>
+                <wp:docPr id="28" name="image36.png"/>
                 <a:graphic>
                   <a:graphicData uri="http://schemas.openxmlformats.org/drawingml/2006/picture">
                     <pic:pic>
                       <pic:nvPicPr>
-                        <pic:cNvPr id="0" name="image33.png"/>
+                        <pic:cNvPr id="0" name="image36.png"/>
                         <pic:cNvPicPr preferRelativeResize="0"/>
                       </pic:nvPicPr>
                       <pic:blipFill>
@@ -9597,12 +9650,12 @@
                 <wp:extent cx="47625" cy="47625"/>
                 <wp:effectExtent b="0" l="0" r="0" t="0"/>
                 <wp:wrapNone/>
-                <wp:docPr id="37" name="image42.png"/>
+                <wp:docPr id="37" name="image45.png"/>
                 <a:graphic>
                   <a:graphicData uri="http://schemas.openxmlformats.org/drawingml/2006/picture">
                     <pic:pic>
                       <pic:nvPicPr>
-                        <pic:cNvPr id="0" name="image42.png"/>
+                        <pic:cNvPr id="0" name="image45.png"/>
                         <pic:cNvPicPr preferRelativeResize="0"/>
                       </pic:nvPicPr>
                       <pic:blipFill>
@@ -10976,12 +11029,12 @@
                 <wp:extent cx="47625" cy="47625"/>
                 <wp:effectExtent b="0" l="0" r="0" t="0"/>
                 <wp:wrapNone/>
-                <wp:docPr id="30" name="image35.png"/>
+                <wp:docPr id="30" name="image38.png"/>
                 <a:graphic>
                   <a:graphicData uri="http://schemas.openxmlformats.org/drawingml/2006/picture">
                     <pic:pic>
                       <pic:nvPicPr>
-                        <pic:cNvPr id="0" name="image35.png"/>
+                        <pic:cNvPr id="0" name="image38.png"/>
                         <pic:cNvPicPr preferRelativeResize="0"/>
                       </pic:nvPicPr>
                       <pic:blipFill>
@@ -11177,12 +11230,12 @@
                 <wp:extent cx="47625" cy="47625"/>
                 <wp:effectExtent b="0" l="0" r="0" t="0"/>
                 <wp:wrapNone/>
-                <wp:docPr id="33" name="image38.png"/>
+                <wp:docPr id="33" name="image41.png"/>
                 <a:graphic>
                   <a:graphicData uri="http://schemas.openxmlformats.org/drawingml/2006/picture">
                     <pic:pic>
                       <pic:nvPicPr>
-                        <pic:cNvPr id="0" name="image38.png"/>
+                        <pic:cNvPr id="0" name="image41.png"/>
                         <pic:cNvPicPr preferRelativeResize="0"/>
                       </pic:nvPicPr>
                       <pic:blipFill>

</xml_diff>